<commit_message>
feat(branding): implement SPEC-16 document templates and branding subsystem with official Aure System logo
</commit_message>
<xml_diff>
--- a/clients/roberto-viola/quotes/prev-101-2025.docx
+++ b/clients/roberto-viola/quotes/prev-101-2025.docx
@@ -2,14 +2,108 @@
 <file path=word/document.xml><?xml version="1.0" encoding="utf-8"?>
 <w:document xmlns:wpc="http://schemas.microsoft.com/office/word/2010/wordprocessingCanvas" xmlns:mo="http://schemas.microsoft.com/office/mac/office/2008/main" xmlns:mc="http://schemas.openxmlformats.org/markup-compatibility/2006" xmlns:mv="urn:schemas-microsoft-com:mac:vml" xmlns:o="urn:schemas-microsoft-com:office:office" xmlns:r="http://schemas.openxmlformats.org/officeDocument/2006/relationships" xmlns:m="http://schemas.openxmlformats.org/officeDocument/2006/math" xmlns:v="urn:schemas-microsoft-com:vml" xmlns:wp14="http://schemas.microsoft.com/office/word/2010/wordprocessingDrawing" xmlns:wp="http://schemas.openxmlformats.org/drawingml/2006/wordprocessingDrawing" xmlns:w10="urn:schemas-microsoft-com:office:word" xmlns:w="http://schemas.openxmlformats.org/wordprocessingml/2006/main" xmlns:w14="http://schemas.microsoft.com/office/word/2010/wordml" xmlns:wpg="http://schemas.microsoft.com/office/word/2010/wordprocessingGroup" xmlns:wpi="http://schemas.microsoft.com/office/word/2010/wordprocessingInk" xmlns:wne="http://schemas.microsoft.com/office/word/2006/wordml" xmlns:wps="http://schemas.microsoft.com/office/word/2010/wordprocessingShape" mc:Ignorable="w14 wp14">
   <w:body>
+    <w:tbl>
+      <w:tblPr>
+        <w:tblW w:type="auto" w:w="0"/>
+        <w:jc w:val="center"/>
+        <w:tblLayout w:type="fixed"/>
+        <w:tblLook w:firstColumn="1" w:firstRow="1" w:lastColumn="0" w:lastRow="0" w:noHBand="0" w:noVBand="1" w:val="04A0"/>
+      </w:tblPr>
+      <w:tblGrid>
+        <w:gridCol w:w="4968"/>
+        <w:gridCol w:w="4968"/>
+      </w:tblGrid>
+      <w:tr>
+        <w:tc>
+          <w:tcPr>
+            <w:tcW w:type="dxa" w:w="4968"/>
+          </w:tcPr>
+          <w:p>
+            <w:pPr>
+              <w:jc w:val="left"/>
+            </w:pPr>
+            <w:r>
+              <w:drawing>
+                <wp:inline xmlns:a="http://schemas.openxmlformats.org/drawingml/2006/main" xmlns:pic="http://schemas.openxmlformats.org/drawingml/2006/picture">
+                  <wp:extent cx="1143000" cy="1143000"/>
+                  <wp:docPr id="1" name="Picture 1"/>
+                  <wp:cNvGraphicFramePr>
+                    <a:graphicFrameLocks noChangeAspect="1"/>
+                  </wp:cNvGraphicFramePr>
+                  <a:graphic>
+                    <a:graphicData uri="http://schemas.openxmlformats.org/drawingml/2006/picture">
+                      <pic:pic>
+                        <pic:nvPicPr>
+                          <pic:cNvPr id="0" name="logo.png"/>
+                          <pic:cNvPicPr/>
+                        </pic:nvPicPr>
+                        <pic:blipFill>
+                          <a:blip r:embed="rId9"/>
+                          <a:stretch>
+                            <a:fillRect/>
+                          </a:stretch>
+                        </pic:blipFill>
+                        <pic:spPr>
+                          <a:xfrm>
+                            <a:off x="0" y="0"/>
+                            <a:ext cx="1143000" cy="1143000"/>
+                          </a:xfrm>
+                          <a:prstGeom prst="rect"/>
+                        </pic:spPr>
+                      </pic:pic>
+                    </a:graphicData>
+                  </a:graphic>
+                </wp:inline>
+              </w:drawing>
+            </w:r>
+          </w:p>
+        </w:tc>
+        <w:tc>
+          <w:tcPr>
+            <w:tcW w:type="dxa" w:w="4968"/>
+          </w:tcPr>
+          <w:p>
+            <w:pPr>
+              <w:jc w:val="right"/>
+            </w:pPr>
+            <w:r>
+              <w:rPr>
+                <w:b/>
+                <w:color w:val="1E3A8A"/>
+                <w:sz w:val="19"/>
+              </w:rPr>
+              <w:t>Aure System di Eduardo Possumato</w:t>
+              <w:br/>
+            </w:r>
+            <w:r>
+              <w:rPr>
+                <w:color w:val="64748B"/>
+                <w:sz w:val="17"/>
+              </w:rPr>
+              <w:t>Via Luigi Tansillo, 54 F - 80125 Napoli (NA)</w:t>
+              <w:br/>
+              <w:t>P.IVA: IT07714231219  |  PEC: salvatorepossumato@pec.it</w:t>
+              <w:br/>
+              <w:t>Tel: +39 333 7328065  |  Web: www.auresystem.it</w:t>
+            </w:r>
+          </w:p>
+        </w:tc>
+      </w:tr>
+    </w:tbl>
     <w:p>
       <w:pPr>
-        <w:pStyle w:val="Title"/>
+        <w:spacing w:before="160"/>
+      </w:pPr>
+    </w:p>
+    <w:p>
+      <w:pPr>
         <w:jc w:val="center"/>
       </w:pPr>
       <w:r>
         <w:rPr>
+          <w:b/>
           <w:color w:val="1E3A8A"/>
+          <w:sz w:val="32"/>
         </w:rPr>
         <w:t>PROPOSTA COMMERCIALE &amp; PREVENTIVO</w:t>
       </w:r>
@@ -21,9 +115,9 @@
       <w:r>
         <w:rPr>
           <w:color w:val="64748B"/>
-          <w:sz w:val="20"/>
+          <w:sz w:val="19"/>
         </w:rPr>
-        <w:t>ID Documento: PREV-101-2025  |  Data: 2025-12-30  |  Validità: fino al 2026-02-28</w:t>
+        <w:t>ID Documento: PREV-101-2025  |  Data Offerta: 2025-12-30  |  Validità: fino al 2026-02-28</w:t>
       </w:r>
     </w:p>
     <w:p/>
@@ -52,13 +146,13 @@
               <w:br/>
             </w:r>
             <w:r>
-              <w:t>Aure System / ITInfra Business Ops</w:t>
+              <w:t>Aure System di Eduardo Possumato</w:t>
               <w:br/>
-              <w:t>Via Luigi Tansillo, 54 F</w:t>
-              <w:br/>
-              <w:t>80125 Napoli (NA)</w:t>
+              <w:t>Via Luigi Tansillo, 54 F - 80125 Napoli (NA)</w:t>
               <w:br/>
               <w:t>P.IVA: IT07714231219</w:t>
+              <w:br/>
+              <w:t>Tel: +39 333 7328065</w:t>
             </w:r>
           </w:p>
         </w:tc>
@@ -75,7 +169,7 @@
               <w:br/>
             </w:r>
             <w:r>
-              <w:t>Cliente</w:t>
+              <w:t>Studio Legale Avv. Roberto Viola</w:t>
               <w:br/>
             </w:r>
             <w:r>
@@ -92,7 +186,7 @@
       </w:pPr>
       <w:r>
         <w:rPr>
-          <w:color w:val="2563EB"/>
+          <w:color w:val="1E3A8A"/>
         </w:rPr>
         <w:t>Hardware Server Network</w:t>
       </w:r>
@@ -119,6 +213,7 @@
             <w:r>
               <w:rPr>
                 <w:b/>
+                <w:color w:val="FFFFFF"/>
                 <w:sz w:val="19"/>
               </w:rPr>
               <w:t>Codice</w:t>
@@ -133,6 +228,7 @@
             <w:r>
               <w:rPr>
                 <w:b/>
+                <w:color w:val="FFFFFF"/>
                 <w:sz w:val="19"/>
               </w:rPr>
               <w:t>Descrizione</w:t>
@@ -147,6 +243,7 @@
             <w:r>
               <w:rPr>
                 <w:b/>
+                <w:color w:val="FFFFFF"/>
                 <w:sz w:val="19"/>
               </w:rPr>
               <w:t>Q.tà</w:t>
@@ -161,6 +258,7 @@
             <w:r>
               <w:rPr>
                 <w:b/>
+                <w:color w:val="FFFFFF"/>
                 <w:sz w:val="19"/>
               </w:rPr>
               <w:t>Prezzo Unit.</w:t>
@@ -175,6 +273,7 @@
             <w:r>
               <w:rPr>
                 <w:b/>
+                <w:color w:val="FFFFFF"/>
                 <w:sz w:val="19"/>
               </w:rPr>
               <w:t>Totale Netto</w:t>
@@ -324,7 +423,7 @@
       </w:pPr>
       <w:r>
         <w:rPr>
-          <w:color w:val="2563EB"/>
+          <w:color w:val="1E3A8A"/>
         </w:rPr>
         <w:t>Software Licenses</w:t>
       </w:r>
@@ -351,6 +450,7 @@
             <w:r>
               <w:rPr>
                 <w:b/>
+                <w:color w:val="FFFFFF"/>
                 <w:sz w:val="19"/>
               </w:rPr>
               <w:t>Codice</w:t>
@@ -365,6 +465,7 @@
             <w:r>
               <w:rPr>
                 <w:b/>
+                <w:color w:val="FFFFFF"/>
                 <w:sz w:val="19"/>
               </w:rPr>
               <w:t>Descrizione</w:t>
@@ -379,6 +480,7 @@
             <w:r>
               <w:rPr>
                 <w:b/>
+                <w:color w:val="FFFFFF"/>
                 <w:sz w:val="19"/>
               </w:rPr>
               <w:t>Q.tà</w:t>
@@ -393,6 +495,7 @@
             <w:r>
               <w:rPr>
                 <w:b/>
+                <w:color w:val="FFFFFF"/>
                 <w:sz w:val="19"/>
               </w:rPr>
               <w:t>Prezzo Unit.</w:t>
@@ -407,6 +510,7 @@
             <w:r>
               <w:rPr>
                 <w:b/>
+                <w:color w:val="FFFFFF"/>
                 <w:sz w:val="19"/>
               </w:rPr>
               <w:t>Totale Netto</w:t>
@@ -489,7 +593,7 @@
       </w:pPr>
       <w:r>
         <w:rPr>
-          <w:color w:val="2563EB"/>
+          <w:color w:val="1E3A8A"/>
         </w:rPr>
         <w:t>Professional Services</w:t>
       </w:r>
@@ -516,6 +620,7 @@
             <w:r>
               <w:rPr>
                 <w:b/>
+                <w:color w:val="FFFFFF"/>
                 <w:sz w:val="19"/>
               </w:rPr>
               <w:t>Codice</w:t>
@@ -530,6 +635,7 @@
             <w:r>
               <w:rPr>
                 <w:b/>
+                <w:color w:val="FFFFFF"/>
                 <w:sz w:val="19"/>
               </w:rPr>
               <w:t>Descrizione</w:t>
@@ -544,6 +650,7 @@
             <w:r>
               <w:rPr>
                 <w:b/>
+                <w:color w:val="FFFFFF"/>
                 <w:sz w:val="19"/>
               </w:rPr>
               <w:t>Q.tà</w:t>
@@ -558,6 +665,7 @@
             <w:r>
               <w:rPr>
                 <w:b/>
+                <w:color w:val="FFFFFF"/>
                 <w:sz w:val="19"/>
               </w:rPr>
               <w:t>Prezzo Unit.</w:t>
@@ -572,6 +680,7 @@
             <w:r>
               <w:rPr>
                 <w:b/>
+                <w:color w:val="FFFFFF"/>
                 <w:sz w:val="19"/>
               </w:rPr>
               <w:t>Totale Netto</w:t>
@@ -925,6 +1034,8 @@
           <w:p>
             <w:r>
               <w:t>Per la Società Fornitrice:</w:t>
+              <w:br/>
+              <w:t>Aure System di Eduardo Possumato</w:t>
             </w:r>
           </w:p>
         </w:tc>
@@ -934,7 +1045,9 @@
           </w:tcPr>
           <w:p>
             <w:r>
-              <w:t>Per Accettazione Cliente (Timbro e Firma):</w:t>
+              <w:t>Per Accettazione Committente (Timbro e Firma):</w:t>
+              <w:br/>
+              <w:t>Studio Legale Avv. Roberto Viola</w:t>
             </w:r>
           </w:p>
         </w:tc>
@@ -962,13 +1075,14 @@
               <w:br/>
               <w:t>__________________________________</w:t>
               <w:br/>
-              <w:t>None</w:t>
+              <w:t>Studio Legale Avv. Roberto Viola</w:t>
             </w:r>
           </w:p>
         </w:tc>
       </w:tr>
     </w:tbl>
     <w:sectPr>
+      <w:footerReference w:type="default" r:id="rId10"/>
       <w:pgSz w:w="12240" w:h="15840"/>
       <w:pgMar w:top="1152" w:right="1152" w:bottom="1152" w:left="1152" w:header="720" w:footer="720" w:gutter="0"/>
       <w:cols w:space="720"/>
@@ -976,6 +1090,24 @@
     </w:sectPr>
   </w:body>
 </w:document>
+</file>
+
+<file path=word/footer1.xml><?xml version="1.0" encoding="utf-8"?>
+<w:ftr xmlns:m="http://schemas.openxmlformats.org/officeDocument/2006/math" xmlns:mc="http://schemas.openxmlformats.org/markup-compatibility/2006" xmlns:mo="http://schemas.microsoft.com/office/mac/office/2008/main" xmlns:mv="urn:schemas-microsoft-com:mac:vml" xmlns:o="urn:schemas-microsoft-com:office:office" xmlns:r="http://schemas.openxmlformats.org/officeDocument/2006/relationships" xmlns:v="urn:schemas-microsoft-com:vml" xmlns:w10="urn:schemas-microsoft-com:office:word" xmlns:w14="http://schemas.microsoft.com/office/word/2010/wordml" xmlns:w="http://schemas.openxmlformats.org/wordprocessingml/2006/main" xmlns:wne="http://schemas.microsoft.com/office/word/2006/wordml" xmlns:wp14="http://schemas.microsoft.com/office/word/2010/wordprocessingDrawing" xmlns:wp="http://schemas.openxmlformats.org/drawingml/2006/wordprocessingDrawing" xmlns:wpc="http://schemas.microsoft.com/office/word/2010/wordprocessingCanvas" xmlns:wpg="http://schemas.microsoft.com/office/word/2010/wordprocessingGroup" xmlns:wpi="http://schemas.microsoft.com/office/word/2010/wordprocessingInk" xmlns:wps="http://schemas.microsoft.com/office/word/2010/wordprocessingShape" mc:Ignorable="w14 wp14">
+  <w:p>
+    <w:pPr>
+      <w:pStyle w:val="Footer"/>
+      <w:jc w:val="center"/>
+    </w:pPr>
+    <w:r>
+      <w:rPr>
+        <w:color w:val="64748B"/>
+        <w:sz w:val="16"/>
+      </w:rPr>
+      <w:t>Aure System di Eduardo Possumato — Documento Riservato ai sensi del Reg. UE 2016/679 (GDPR)</w:t>
+    </w:r>
+  </w:p>
+</w:ftr>
 </file>
 
 <file path=word/numbering.xml><?xml version="1.0" encoding="utf-8"?>

</xml_diff>